<commit_message>
Alinear todo a Cloud & Data Engineer (foco cloud, rumbo a Cloud Architect)
Titulo, resumen y orden de skills priorizando Cloud/serverless en CV ES/EN (md+docx+pdf).
</commit_message>
<xml_diff>
--- a/resume/CV_Juan_Berrio_EN.docx
+++ b/resume/CV_Juan_Berrio_EN.docx
@@ -27,7 +27,7 @@
           <w:color w:val="444444"/>
           <w:sz w:val="24"/>
         </w:rPr>
-        <w:t>Data &amp; Analytics Engineer</w:t>
+        <w:t>Cloud &amp; Data Engineer</w:t>
       </w:r>
     </w:p>
     <w:p>
@@ -51,7 +51,7 @@
         <w:rPr>
           <w:sz w:val="20"/>
         </w:rPr>
-        <w:t>Data engineer with 6+ years turning operational and financial data into reliable decision systems. I design and operate production ETL pipelines (Python, DuckDB, Parquet) with incremental ingestion and automated orchestration, and ship analytics on low-cost cloud architectures (Cloudflare R2/Pages, DuckDB-WASM, React). Cut report generation time by up to 60% and built package-level customs tax reconciliation for an international courier operation. Deep domain expertise in logistics, customs and finance.</w:t>
+        <w:t>Cloud &amp; Data Engineer with 6+ years designing low-cost, end-to-end serverless data platforms. Real cloud architecture (Cloudflare R2/Pages/Workers, DuckDB-WASM, React) alongside production ETL pipelines (Python, DuckDB, Parquet) with incremental ingestion and automated orchestration. I think in architecture: separating compute, storage and presentation, choosing serverless and optimizing for cost (systems running on ~$0 infrastructure). Cut report generation time by up to 60%. On the path to Cloud Solutions Architect (studying AWS + Systems Engineering).</w:t>
       </w:r>
     </w:p>
     <w:p>
@@ -68,6 +68,24 @@
           <w:sz w:val="22"/>
         </w:rPr>
         <w:t>TECHNICAL SKILLS</w:t>
+      </w:r>
+    </w:p>
+    <w:p>
+      <w:pPr>
+        <w:spacing w:after="20"/>
+      </w:pPr>
+      <w:r>
+        <w:rPr>
+          <w:b/>
+          <w:sz w:val="19"/>
+        </w:rPr>
+        <w:t xml:space="preserve">Cloud &amp; DevOps:  </w:t>
+      </w:r>
+      <w:r>
+        <w:rPr>
+          <w:sz w:val="19"/>
+        </w:rPr>
+        <w:t>Cloudflare (R2, Pages, Workers) · Serverless architecture · GitHub Actions (CI/CD) · Git · AWS (in progress)</w:t>
       </w:r>
     </w:p>
     <w:p>
@@ -104,24 +122,6 @@
           <w:sz w:val="19"/>
         </w:rPr>
         <w:t>Python (Pandas) · SQL · DuckDB SQL</w:t>
-      </w:r>
-    </w:p>
-    <w:p>
-      <w:pPr>
-        <w:spacing w:after="20"/>
-      </w:pPr>
-      <w:r>
-        <w:rPr>
-          <w:b/>
-          <w:sz w:val="19"/>
-        </w:rPr>
-        <w:t xml:space="preserve">Cloud &amp; DevOps:  </w:t>
-      </w:r>
-      <w:r>
-        <w:rPr>
-          <w:sz w:val="19"/>
-        </w:rPr>
-        <w:t>Cloudflare (R2, Pages, Workers) · GitHub Actions (CI/CD) · Git · AWS (in progress)</w:t>
       </w:r>
     </w:p>
     <w:p>

</xml_diff>

<commit_message>
Agregar AWS Cloud Practitioner Essentials (curso, jun 2026) a CV y portafolio
</commit_message>
<xml_diff>
--- a/resume/CV_Juan_Berrio_EN.docx
+++ b/resume/CV_Juan_Berrio_EN.docx
@@ -591,7 +591,19 @@
         <w:rPr>
           <w:sz w:val="19"/>
         </w:rPr>
-        <w:t>• Python Programming (Levels 0-2) - Code Avengers (90-93%); AWS Data - in progress.</w:t>
+        <w:t>• AWS Cloud Practitioner Essentials - AWS Training &amp; Certification (Jun 2026); Python Programming (Levels 0-2) - Code Avengers (90-93%).</w:t>
+      </w:r>
+    </w:p>
+    <w:p>
+      <w:pPr>
+        <w:spacing w:after="20"/>
+        <w:ind w:left="259"/>
+      </w:pPr>
+      <w:r>
+        <w:rPr>
+          <w:sz w:val="19"/>
+        </w:rPr>
+        <w:t>• AWS Certified Cloud Practitioner (CLF-C02) - in preparation.</w:t>
       </w:r>
     </w:p>
     <w:p>

</xml_diff>